<commit_message>
Update email addresses in documents
</commit_message>
<xml_diff>
--- a/Data_Access_and_Publication_Policy/Exposome_NL_Data_Access_and_Publication_Policy.docx
+++ b/Data_Access_and_Publication_Policy/Exposome_NL_Data_Access_and_Publication_Policy.docx
@@ -119,35 +119,7 @@
           <w:rFonts w:asciiTheme="majorHAnsi" w:hAnsiTheme="majorHAnsi" w:cstheme="majorHAnsi"/>
           <w:lang w:val="en-US"/>
         </w:rPr>
-        <w:t>submitting</w:t>
-      </w:r>
-      <w:r>
-        <w:rPr>
-          <w:rFonts w:asciiTheme="majorHAnsi" w:hAnsiTheme="majorHAnsi" w:cstheme="majorHAnsi"/>
-          <w:lang w:val="en-US"/>
-        </w:rPr>
-        <w:t xml:space="preserve"> </w:t>
-      </w:r>
-      <w:r>
-        <w:rPr>
-          <w:rFonts w:asciiTheme="majorHAnsi" w:hAnsiTheme="majorHAnsi" w:cstheme="majorHAnsi"/>
-          <w:lang w:val="en-US"/>
-        </w:rPr>
-        <w:t>publications and other types of reports based on geographical data (Exposome Surfaces) made</w:t>
-      </w:r>
-      <w:r>
-        <w:rPr>
-          <w:rFonts w:asciiTheme="majorHAnsi" w:hAnsiTheme="majorHAnsi" w:cstheme="majorHAnsi"/>
-          <w:lang w:val="en-US"/>
-        </w:rPr>
-        <w:t xml:space="preserve"> </w:t>
-      </w:r>
-      <w:r>
-        <w:rPr>
-          <w:rFonts w:asciiTheme="majorHAnsi" w:hAnsiTheme="majorHAnsi" w:cstheme="majorHAnsi"/>
-          <w:lang w:val="en-US"/>
-        </w:rPr>
-        <w:t>available through the Exposome-NL data platform.</w:t>
+        <w:t>submitting publications and other types of reports based on geographical data (Exposome Surfaces) made available through the Exposome-NL data platform.</w:t>
       </w:r>
     </w:p>
     <w:p>
@@ -155,29 +127,17 @@
         <w:spacing w:line="240" w:lineRule="auto"/>
         <w:rPr>
           <w:rFonts w:asciiTheme="majorHAnsi" w:hAnsiTheme="majorHAnsi" w:cstheme="majorHAnsi"/>
-          <w:lang w:val="en-US"/>
-        </w:rPr>
-      </w:pPr>
-      <w:r>
-        <w:rPr>
-          <w:rFonts w:asciiTheme="majorHAnsi" w:hAnsiTheme="majorHAnsi" w:cstheme="majorHAnsi"/>
-          <w:lang w:val="en-US"/>
-        </w:rPr>
-        <w:t>The geographical data gathered within the project</w:t>
-      </w:r>
-      <w:r>
-        <w:rPr>
-          <w:rFonts w:asciiTheme="majorHAnsi" w:hAnsiTheme="majorHAnsi" w:cstheme="majorHAnsi"/>
-          <w:lang w:val="en-US"/>
-        </w:rPr>
-        <w:t xml:space="preserve"> </w:t>
-      </w:r>
-      <w:r>
-        <w:rPr>
-          <w:rFonts w:asciiTheme="majorHAnsi" w:hAnsiTheme="majorHAnsi" w:cstheme="majorHAnsi"/>
-          <w:lang w:val="en-US"/>
-        </w:rPr>
-        <w:t>can be accessed via the online portal:</w:t>
+          <w:color w:val="0563C1" w:themeColor="hyperlink"/>
+          <w:u w:val="single"/>
+          <w:lang w:val="en-US"/>
+        </w:rPr>
+      </w:pPr>
+      <w:r>
+        <w:rPr>
+          <w:rFonts w:asciiTheme="majorHAnsi" w:hAnsiTheme="majorHAnsi" w:cstheme="majorHAnsi"/>
+          <w:lang w:val="en-US"/>
+        </w:rPr>
+        <w:t>The geographical data gathered within the project can be accessed via the online portal:</w:t>
       </w:r>
       <w:r>
         <w:rPr>
@@ -193,7 +153,23 @@
             <w:rFonts w:asciiTheme="majorHAnsi" w:hAnsiTheme="majorHAnsi" w:cstheme="majorHAnsi"/>
             <w:lang w:val="en-US"/>
           </w:rPr>
-          <w:t>https://exposome.uu.nl/</w:t>
+          <w:t>expos</w:t>
+        </w:r>
+        <w:r>
+          <w:rPr>
+            <w:rStyle w:val="Hyperlink"/>
+            <w:rFonts w:asciiTheme="majorHAnsi" w:hAnsiTheme="majorHAnsi" w:cstheme="majorHAnsi"/>
+            <w:lang w:val="en-US"/>
+          </w:rPr>
+          <w:t>o</w:t>
+        </w:r>
+        <w:r>
+          <w:rPr>
+            <w:rStyle w:val="Hyperlink"/>
+            <w:rFonts w:asciiTheme="majorHAnsi" w:hAnsiTheme="majorHAnsi" w:cstheme="majorHAnsi"/>
+            <w:lang w:val="en-US"/>
+          </w:rPr>
+          <w:t>me.uu.nl</w:t>
         </w:r>
       </w:hyperlink>
       <w:r>
@@ -326,7 +302,7 @@
           <w:u w:val="single"/>
           <w:lang w:val="en-US"/>
         </w:rPr>
-        <w:t>exposome.office@uu.nl</w:t>
+        <w:t>expanse@uu.nl</w:t>
       </w:r>
       <w:r>
         <w:rPr>
@@ -365,14 +341,7 @@
           <w:rFonts w:asciiTheme="majorHAnsi" w:hAnsiTheme="majorHAnsi" w:cstheme="majorHAnsi"/>
           <w:lang w:val="en-US"/>
         </w:rPr>
-        <w:t xml:space="preserve">a) </w:t>
-      </w:r>
-      <w:r>
-        <w:rPr>
-          <w:rFonts w:asciiTheme="majorHAnsi" w:hAnsiTheme="majorHAnsi" w:cstheme="majorHAnsi"/>
-          <w:lang w:val="en-US"/>
-        </w:rPr>
-        <w:t>Name of institute or</w:t>
+        <w:t>a) Name of institute or</w:t>
       </w:r>
       <w:r>
         <w:rPr>
@@ -713,14 +682,7 @@
           <w:rFonts w:asciiTheme="majorHAnsi" w:hAnsiTheme="majorHAnsi" w:cstheme="majorHAnsi"/>
           <w:lang w:val="en-US"/>
         </w:rPr>
-        <w:t>rigor</w:t>
-      </w:r>
-      <w:r>
-        <w:rPr>
-          <w:rFonts w:asciiTheme="majorHAnsi" w:hAnsiTheme="majorHAnsi" w:cstheme="majorHAnsi"/>
-          <w:lang w:val="en-US"/>
-        </w:rPr>
-        <w:t xml:space="preserve"> of analyses, 2) appropriate project group, and 3) overlap with other known analysis using the</w:t>
+        <w:t>rigor of analyses, 2) appropriate project group, and 3) overlap with other known analysis using the</w:t>
       </w:r>
       <w:r>
         <w:rPr>
@@ -1129,15 +1091,13 @@
         </w:rPr>
         <w:t xml:space="preserve">All manuscripts and (poster) presentations </w:t>
       </w:r>
-      <w:proofErr w:type="spellStart"/>
-      <w:r>
-        <w:rPr>
-          <w:rFonts w:asciiTheme="majorHAnsi" w:hAnsiTheme="majorHAnsi" w:cstheme="majorHAnsi"/>
-          <w:lang w:val="en-US"/>
-        </w:rPr>
-        <w:t>utilising</w:t>
-      </w:r>
-      <w:proofErr w:type="spellEnd"/>
+      <w:r>
+        <w:rPr>
+          <w:rFonts w:asciiTheme="majorHAnsi" w:hAnsiTheme="majorHAnsi" w:cstheme="majorHAnsi"/>
+          <w:lang w:val="en-US"/>
+        </w:rPr>
+        <w:t>utilizing</w:t>
+      </w:r>
       <w:r>
         <w:rPr>
           <w:rFonts w:asciiTheme="majorHAnsi" w:hAnsiTheme="majorHAnsi" w:cstheme="majorHAnsi"/>
@@ -1197,27 +1157,14 @@
         </w:rPr>
         <w:t>belonging to the used surfaces. These can be found in the metadata of each surface. For example, if you use (O3 concentrations) for your analyses, in your manuscript you will refer to its source paper: </w:t>
       </w:r>
-      <w:hyperlink r:id="rId7" w:tgtFrame="_blank" w:history="1">
+      <w:hyperlink r:id="rId7" w:history="1">
         <w:r>
           <w:rPr>
+            <w:rStyle w:val="Hyperlink"/>
             <w:rFonts w:asciiTheme="majorHAnsi" w:hAnsiTheme="majorHAnsi" w:cstheme="majorHAnsi"/>
             <w:lang w:val="en-US"/>
           </w:rPr>
-          <w:t>https://www.sciencedirect.com/science/article/pii/S01</w:t>
-        </w:r>
-        <w:r>
-          <w:rPr>
-            <w:rFonts w:asciiTheme="majorHAnsi" w:hAnsiTheme="majorHAnsi" w:cstheme="majorHAnsi"/>
-            <w:lang w:val="en-US"/>
-          </w:rPr>
-          <w:t>6</w:t>
-        </w:r>
-        <w:r>
-          <w:rPr>
-            <w:rFonts w:asciiTheme="majorHAnsi" w:hAnsiTheme="majorHAnsi" w:cstheme="majorHAnsi"/>
-            <w:lang w:val="en-US"/>
-          </w:rPr>
-          <w:t>0412018309759 </w:t>
+          <w:t>www.sciencedirect.com/science/article/pii/S0160412018309759 </w:t>
         </w:r>
       </w:hyperlink>
       <w:r>
@@ -1263,25 +1210,7 @@
           <w:iCs/>
           <w:lang w:val="en-US"/>
         </w:rPr>
-        <w:t xml:space="preserve">“Surface data was </w:t>
-      </w:r>
-      <w:r>
-        <w:rPr>
-          <w:rFonts w:asciiTheme="majorHAnsi" w:hAnsiTheme="majorHAnsi" w:cstheme="majorHAnsi"/>
-          <w:i/>
-          <w:iCs/>
-          <w:lang w:val="en-US"/>
-        </w:rPr>
-        <w:t>accessed</w:t>
-      </w:r>
-      <w:r>
-        <w:rPr>
-          <w:rFonts w:asciiTheme="majorHAnsi" w:hAnsiTheme="majorHAnsi" w:cstheme="majorHAnsi"/>
-          <w:i/>
-          <w:iCs/>
-          <w:lang w:val="en-US"/>
-        </w:rPr>
-        <w:t xml:space="preserve"> through the Exposome Data Platform tool (https://exposome.uu.nl).”</w:t>
+        <w:t>“Surface data was accessed through the Exposome Data Platform tool (exposome.uu.nl).”</w:t>
       </w:r>
     </w:p>
     <w:p>
@@ -1320,21 +1249,14 @@
           <w:u w:val="single"/>
           <w:lang w:val="en-US"/>
         </w:rPr>
-        <w:t>exposome.office@uu.nl</w:t>
-      </w:r>
-      <w:r>
-        <w:rPr>
-          <w:rFonts w:asciiTheme="majorHAnsi" w:hAnsiTheme="majorHAnsi" w:cstheme="majorHAnsi"/>
-          <w:lang w:val="en-US"/>
-        </w:rPr>
-        <w:t xml:space="preserve"> </w:t>
-      </w:r>
-      <w:r>
-        <w:rPr>
-          <w:rFonts w:asciiTheme="majorHAnsi" w:hAnsiTheme="majorHAnsi" w:cstheme="majorHAnsi"/>
-          <w:lang w:val="en-US"/>
-        </w:rPr>
-        <w:t>for a high-resolution version.</w:t>
+        <w:t>expanse@uu.nl</w:t>
+      </w:r>
+      <w:r>
+        <w:rPr>
+          <w:rFonts w:asciiTheme="majorHAnsi" w:hAnsiTheme="majorHAnsi" w:cstheme="majorHAnsi"/>
+          <w:lang w:val="en-US"/>
+        </w:rPr>
+        <w:t xml:space="preserve"> for a high-resolution version.</w:t>
       </w:r>
     </w:p>
     <w:p>

</xml_diff>